<commit_message>
Added AI declaration form
</commit_message>
<xml_diff>
--- a/AI Use Declaration Form.docx
+++ b/AI Use Declaration Form.docx
@@ -75,7 +75,19 @@
         <w:rPr>
           <w:rFonts w:ascii="Times New Roman" w:hAnsi="Times New Roman" w:cs="Times New Roman"/>
         </w:rPr>
-        <w:t>Supervised and Non-supervised Learning</w:t>
+        <w:t>Supervised and</w:t>
+      </w:r>
+      <w:r>
+        <w:rPr>
+          <w:rFonts w:ascii="Times New Roman" w:hAnsi="Times New Roman" w:cs="Times New Roman"/>
+        </w:rPr>
+        <w:t xml:space="preserve"> Un</w:t>
+      </w:r>
+      <w:r>
+        <w:rPr>
+          <w:rFonts w:ascii="Times New Roman" w:hAnsi="Times New Roman" w:cs="Times New Roman"/>
+        </w:rPr>
+        <w:t>supervised Learning</w:t>
       </w:r>
       <w:r>
         <w:rPr>
@@ -657,7 +669,49 @@
               <w:rPr>
                 <w:rFonts w:ascii="Times New Roman" w:hAnsi="Times New Roman" w:cs="Times New Roman"/>
               </w:rPr>
-              <w:t>Hey good friend, I have had a ML assignment, so I'll want you to guide me through the TODOs. Mind you, you are not giving me direct solutions but you'll be my guidance to let me understand how some of the todos must be implemented. So I learn my doing. Let's get started</w:t>
+              <w:t xml:space="preserve">Hey good friend, I have had a ML assignment, so I'll want you to guide me through the TODOs. Mind you, you are not giving me direct </w:t>
+            </w:r>
+            <w:proofErr w:type="gramStart"/>
+            <w:r>
+              <w:rPr>
+                <w:rFonts w:ascii="Times New Roman" w:hAnsi="Times New Roman" w:cs="Times New Roman"/>
+              </w:rPr>
+              <w:t>solutions</w:t>
+            </w:r>
+            <w:proofErr w:type="gramEnd"/>
+            <w:r>
+              <w:rPr>
+                <w:rFonts w:ascii="Times New Roman" w:hAnsi="Times New Roman" w:cs="Times New Roman"/>
+              </w:rPr>
+              <w:t xml:space="preserve"> but you'll be my guidance to let me understand how some of the </w:t>
+            </w:r>
+            <w:proofErr w:type="spellStart"/>
+            <w:r>
+              <w:rPr>
+                <w:rFonts w:ascii="Times New Roman" w:hAnsi="Times New Roman" w:cs="Times New Roman"/>
+              </w:rPr>
+              <w:t>todos</w:t>
+            </w:r>
+            <w:proofErr w:type="spellEnd"/>
+            <w:r>
+              <w:rPr>
+                <w:rFonts w:ascii="Times New Roman" w:hAnsi="Times New Roman" w:cs="Times New Roman"/>
+              </w:rPr>
+              <w:t xml:space="preserve"> must be implemented. </w:t>
+            </w:r>
+            <w:proofErr w:type="gramStart"/>
+            <w:r>
+              <w:rPr>
+                <w:rFonts w:ascii="Times New Roman" w:hAnsi="Times New Roman" w:cs="Times New Roman"/>
+              </w:rPr>
+              <w:t>So</w:t>
+            </w:r>
+            <w:proofErr w:type="gramEnd"/>
+            <w:r>
+              <w:rPr>
+                <w:rFonts w:ascii="Times New Roman" w:hAnsi="Times New Roman" w:cs="Times New Roman"/>
+              </w:rPr>
+              <w:t xml:space="preserve"> I learn my doing. Let's get started</w:t>
             </w:r>
           </w:p>
         </w:tc>
@@ -761,7 +815,23 @@
                 <w:lang w:val="en-GH"/>
               </w:rPr>
               <w:lastRenderedPageBreak/>
-              <w:t>I also want you to help me get these with good explanations so I understand</w:t>
+              <w:t xml:space="preserve">I also want you to help me get these with good </w:t>
+            </w:r>
+            <w:proofErr w:type="gramStart"/>
+            <w:r>
+              <w:rPr>
+                <w:rFonts w:ascii="Times New Roman" w:hAnsi="Times New Roman" w:cs="Times New Roman"/>
+                <w:lang w:val="en-GH"/>
+              </w:rPr>
+              <w:t>explanations</w:t>
+            </w:r>
+            <w:proofErr w:type="gramEnd"/>
+            <w:r>
+              <w:rPr>
+                <w:rFonts w:ascii="Times New Roman" w:hAnsi="Times New Roman" w:cs="Times New Roman"/>
+                <w:lang w:val="en-GH"/>
+              </w:rPr>
+              <w:t xml:space="preserve"> so I understand</w:t>
             </w:r>
           </w:p>
           <w:p>
@@ -792,37 +862,135 @@
                 <w:rFonts w:ascii="Times New Roman" w:hAnsi="Times New Roman" w:cs="Times New Roman"/>
                 <w:lang w:val="en-GH"/>
               </w:rPr>
-              <w:t>#   - tip_rate proxy, fare-per-mile = fare_amount / trip_distance</w:t>
-            </w:r>
-          </w:p>
-          <w:p>
-            <w:pPr>
+              <w:t xml:space="preserve">#   - </w:t>
+            </w:r>
+            <w:proofErr w:type="spellStart"/>
+            <w:r>
               <w:rPr>
                 <w:rFonts w:ascii="Times New Roman" w:hAnsi="Times New Roman" w:cs="Times New Roman"/>
                 <w:lang w:val="en-GH"/>
               </w:rPr>
-            </w:pPr>
+              <w:t>tip_rate</w:t>
+            </w:r>
+            <w:proofErr w:type="spellEnd"/>
             <w:r>
               <w:rPr>
                 <w:rFonts w:ascii="Times New Roman" w:hAnsi="Times New Roman" w:cs="Times New Roman"/>
                 <w:lang w:val="en-GH"/>
               </w:rPr>
-              <w:t>#   - total surcharges = mta_tax + tolls_amount + improvement_surcharge</w:t>
-            </w:r>
-          </w:p>
-          <w:p>
-            <w:pPr>
+              <w:t xml:space="preserve"> proxy, fare-per-mile = </w:t>
+            </w:r>
+            <w:proofErr w:type="spellStart"/>
+            <w:r>
               <w:rPr>
                 <w:rFonts w:ascii="Times New Roman" w:hAnsi="Times New Roman" w:cs="Times New Roman"/>
                 <w:lang w:val="en-GH"/>
               </w:rPr>
-            </w:pPr>
+              <w:t>fare_amount</w:t>
+            </w:r>
+            <w:proofErr w:type="spellEnd"/>
             <w:r>
               <w:rPr>
                 <w:rFonts w:ascii="Times New Roman" w:hAnsi="Times New Roman" w:cs="Times New Roman"/>
                 <w:lang w:val="en-GH"/>
               </w:rPr>
-              <w:t>#   (Careful: do NOT leak the target. Do not build features directly from</w:t>
+              <w:t xml:space="preserve"> / </w:t>
+            </w:r>
+            <w:proofErr w:type="spellStart"/>
+            <w:r>
+              <w:rPr>
+                <w:rFonts w:ascii="Times New Roman" w:hAnsi="Times New Roman" w:cs="Times New Roman"/>
+                <w:lang w:val="en-GH"/>
+              </w:rPr>
+              <w:t>trip_distance</w:t>
+            </w:r>
+            <w:proofErr w:type="spellEnd"/>
+          </w:p>
+          <w:p>
+            <w:pPr>
+              <w:rPr>
+                <w:rFonts w:ascii="Times New Roman" w:hAnsi="Times New Roman" w:cs="Times New Roman"/>
+                <w:lang w:val="en-GH"/>
+              </w:rPr>
+            </w:pPr>
+            <w:r>
+              <w:rPr>
+                <w:rFonts w:ascii="Times New Roman" w:hAnsi="Times New Roman" w:cs="Times New Roman"/>
+                <w:lang w:val="en-GH"/>
+              </w:rPr>
+              <w:t xml:space="preserve">#   - total surcharges = </w:t>
+            </w:r>
+            <w:proofErr w:type="spellStart"/>
+            <w:r>
+              <w:rPr>
+                <w:rFonts w:ascii="Times New Roman" w:hAnsi="Times New Roman" w:cs="Times New Roman"/>
+                <w:lang w:val="en-GH"/>
+              </w:rPr>
+              <w:t>mta_tax</w:t>
+            </w:r>
+            <w:proofErr w:type="spellEnd"/>
+            <w:r>
+              <w:rPr>
+                <w:rFonts w:ascii="Times New Roman" w:hAnsi="Times New Roman" w:cs="Times New Roman"/>
+                <w:lang w:val="en-GH"/>
+              </w:rPr>
+              <w:t xml:space="preserve"> + </w:t>
+            </w:r>
+            <w:proofErr w:type="spellStart"/>
+            <w:r>
+              <w:rPr>
+                <w:rFonts w:ascii="Times New Roman" w:hAnsi="Times New Roman" w:cs="Times New Roman"/>
+                <w:lang w:val="en-GH"/>
+              </w:rPr>
+              <w:t>tolls_amount</w:t>
+            </w:r>
+            <w:proofErr w:type="spellEnd"/>
+            <w:r>
+              <w:rPr>
+                <w:rFonts w:ascii="Times New Roman" w:hAnsi="Times New Roman" w:cs="Times New Roman"/>
+                <w:lang w:val="en-GH"/>
+              </w:rPr>
+              <w:t xml:space="preserve"> + </w:t>
+            </w:r>
+            <w:proofErr w:type="spellStart"/>
+            <w:r>
+              <w:rPr>
+                <w:rFonts w:ascii="Times New Roman" w:hAnsi="Times New Roman" w:cs="Times New Roman"/>
+                <w:lang w:val="en-GH"/>
+              </w:rPr>
+              <w:t>improvement_surcharge</w:t>
+            </w:r>
+            <w:proofErr w:type="spellEnd"/>
+          </w:p>
+          <w:p>
+            <w:pPr>
+              <w:rPr>
+                <w:rFonts w:ascii="Times New Roman" w:hAnsi="Times New Roman" w:cs="Times New Roman"/>
+                <w:lang w:val="en-GH"/>
+              </w:rPr>
+            </w:pPr>
+            <w:r>
+              <w:rPr>
+                <w:rFonts w:ascii="Times New Roman" w:hAnsi="Times New Roman" w:cs="Times New Roman"/>
+                <w:lang w:val="en-GH"/>
+              </w:rPr>
+              <w:t>#</w:t>
+            </w:r>
+            <w:proofErr w:type="gramStart"/>
+            <w:r>
+              <w:rPr>
+                <w:rFonts w:ascii="Times New Roman" w:hAnsi="Times New Roman" w:cs="Times New Roman"/>
+                <w:lang w:val="en-GH"/>
+              </w:rPr>
+              <w:t xml:space="preserve">   (</w:t>
+            </w:r>
+            <w:proofErr w:type="gramEnd"/>
+            <w:r>
+              <w:rPr>
+                <w:rFonts w:ascii="Times New Roman" w:hAnsi="Times New Roman" w:cs="Times New Roman"/>
+                <w:lang w:val="en-GH"/>
+              </w:rPr>
+              <w:t>Careful: do NOT leak the target. Do not build features directly from</w:t>
             </w:r>
             <w:r>
               <w:rPr>
@@ -831,7 +999,27 @@
                 <w:iCs/>
                 <w:lang w:val="en-GH"/>
               </w:rPr>
-              <w:t xml:space="preserve"> tip_amount.)</w:t>
+              <w:t xml:space="preserve"> </w:t>
+            </w:r>
+            <w:proofErr w:type="spellStart"/>
+            <w:r>
+              <w:rPr>
+                <w:rFonts w:ascii="Times New Roman" w:hAnsi="Times New Roman" w:cs="Times New Roman"/>
+                <w:i/>
+                <w:iCs/>
+                <w:lang w:val="en-GH"/>
+              </w:rPr>
+              <w:t>tip_amount</w:t>
+            </w:r>
+            <w:proofErr w:type="spellEnd"/>
+            <w:r>
+              <w:rPr>
+                <w:rFonts w:ascii="Times New Roman" w:hAnsi="Times New Roman" w:cs="Times New Roman"/>
+                <w:i/>
+                <w:iCs/>
+                <w:lang w:val="en-GH"/>
+              </w:rPr>
+              <w:t>.)</w:t>
             </w:r>
           </w:p>
           <w:p>
@@ -945,7 +1133,21 @@
               <w:rPr>
                 <w:rFonts w:ascii="Times New Roman" w:hAnsi="Times New Roman" w:cs="Times New Roman"/>
               </w:rPr>
-              <w:t>can i rescale the y axis to be 500s</w:t>
+              <w:t xml:space="preserve">can </w:t>
+            </w:r>
+            <w:proofErr w:type="spellStart"/>
+            <w:r>
+              <w:rPr>
+                <w:rFonts w:ascii="Times New Roman" w:hAnsi="Times New Roman" w:cs="Times New Roman"/>
+              </w:rPr>
+              <w:t>i</w:t>
+            </w:r>
+            <w:proofErr w:type="spellEnd"/>
+            <w:r>
+              <w:rPr>
+                <w:rFonts w:ascii="Times New Roman" w:hAnsi="Times New Roman" w:cs="Times New Roman"/>
+              </w:rPr>
+              <w:t xml:space="preserve"> rescale the y axis to be 500s</w:t>
             </w:r>
           </w:p>
         </w:tc>
@@ -977,11 +1179,19 @@
                 <w:rFonts w:ascii="Times New Roman" w:hAnsi="Times New Roman" w:cs="Times New Roman"/>
               </w:rPr>
             </w:pPr>
-            <w:r>
-              <w:rPr>
-                <w:rFonts w:ascii="Times New Roman" w:hAnsi="Times New Roman" w:cs="Times New Roman"/>
-              </w:rPr>
-              <w:t>Chose a good scale</w:t>
+            <w:proofErr w:type="gramStart"/>
+            <w:r>
+              <w:rPr>
+                <w:rFonts w:ascii="Times New Roman" w:hAnsi="Times New Roman" w:cs="Times New Roman"/>
+              </w:rPr>
+              <w:t>Chose</w:t>
+            </w:r>
+            <w:proofErr w:type="gramEnd"/>
+            <w:r>
+              <w:rPr>
+                <w:rFonts w:ascii="Times New Roman" w:hAnsi="Times New Roman" w:cs="Times New Roman"/>
+              </w:rPr>
+              <w:t xml:space="preserve"> a good scale</w:t>
             </w:r>
           </w:p>
         </w:tc>
@@ -2682,6 +2892,7 @@
   <w:style w:type="character" w:default="1" w:styleId="DefaultParagraphFont">
     <w:name w:val="Default Paragraph Font"/>
     <w:uiPriority w:val="1"/>
+    <w:semiHidden/>
     <w:unhideWhenUsed/>
   </w:style>
   <w:style w:type="table" w:default="1" w:styleId="TableNormal">

</xml_diff>